<commit_message>
Remove RITME keyword (no Manychat flow)
Co-Authored-By: Claude Opus 5.5 <noreply@anthropic.com>
Claude-Session: https://claude.ai/code/session_01UFG6wfiLh4SnfFiXEqDCn7
</commit_message>
<xml_diff>
--- a/docs/Simply-in-Balance-Content-Kennisbank.docx
+++ b/docs/Simply-in-Balance-Content-Kennisbank.docx
@@ -3464,32 +3464,6 @@
             </w:pPr>
             <w:r>
               <w:t xml:space="preserve">video over stressbelasting en cortisol</w:t>
-            </w:r>
-          </w:p>
-        </w:tc>
-      </w:tr>
-      <w:tr>
-        <w:tc>
-          <w:tcPr/>
-          <w:p>
-            <w:pPr>
-              <w:pStyle w:val="Compact"/>
-              <w:jc w:val="left"/>
-            </w:pPr>
-            <w:r>
-              <w:t xml:space="preserve">RITME</w:t>
-            </w:r>
-          </w:p>
-        </w:tc>
-        <w:tc>
-          <w:tcPr/>
-          <w:p>
-            <w:pPr>
-              <w:pStyle w:val="Compact"/>
-              <w:jc w:val="left"/>
-            </w:pPr>
-            <w:r>
-              <w:t xml:space="preserve">video over ritme en herstel (vermoeidheid)</w:t>
             </w:r>
           </w:p>
         </w:tc>

</xml_diff>